<commit_message>
feat: synchronize documents after some changes while implementation
</commit_message>
<xml_diff>
--- a/doc/consumer/description.docx
+++ b/doc/consumer/description.docx
@@ -52,7 +52,7 @@
           <w:sz w:val="22"/>
           <w:szCs w:val="22"/>
         </w:rPr>
-        <w:t xml:space="preserve">Parses and holds the Consumer's command-line arguments: the statistics reporting interval in seconds (reportIntervalSeconds, defaults to 1). Validates the input parameters and exposes them to the rest of the application.</w:t>
+        <w:t xml:space="preserve">Parses and holds the Consumer's command-line arguments: the statistics reporting interval (reportInterval, a chrono::seconds, defaults to 1). Validates the input parameters and exposes them to the rest of the application.</w:t>
       </w:r>
     </w:p>
     <w:p>
@@ -154,7 +154,7 @@
           <w:sz w:val="22"/>
           <w:szCs w:val="22"/>
         </w:rPr>
-        <w:t xml:space="preserve">A thin wrapper over the Linux futex() syscall (FUTEX_WAIT/FUTEX_WAKE) around the atomic writeIndex word in shared memory. Used by SharedRingBufferReader to wait for new data without busy-waiting when the buffer is empty.</w:t>
+        <w:t xml:space="preserve">A thin wrapper over the Linux futex() syscall (FUTEX_WAIT/FUTEX_WAKE) around a dedicated 32-bit notify word in the control block, kept separate from the 64-bit writeIndex since futex only operates on 32-bit words. Used by SharedRingBufferReader to wait for new data without busy-waiting when the buffer is empty.</w:t>
       </w:r>
     </w:p>
     <w:p>
@@ -188,7 +188,7 @@
           <w:sz w:val="22"/>
           <w:szCs w:val="22"/>
         </w:rPr>
-        <w:t xml:space="preserve">Attaches (shm_open in read mode + mmap) to the named POSIX shared memory segment created by Producer. The attach() method retries the connection with a delay (retry with backoff) until the segment appears. The tryConsume() method checks whether new data is available (readIndex != writeIndex); if not, it waits via FutexGate; if so, it reads the slot at readIndex, applies a seqlock version check (a packet is discarded as corrupted if a race with the writing Producer is detected), advances readIndex, and returns the packet read.</w:t>
+        <w:t xml:space="preserve">Attaches (shm_open in read mode + mmap) to the named POSIX shared memory segment created by Producer. The attach(name, signals) method retries with backoff until the segment appears or SignalController reports a stop request, returning false in the latter case. The tryConsume() method checks whether new data is available (readIndex != writeIndex); if not, it waits via FutexGate; if so, it reads the slot at readIndex, applies a seqlock version check (retrying until it observes a stable snapshot), advances readIndex, and returns the packet read.</w:t>
       </w:r>
     </w:p>
     <w:p>
@@ -222,7 +222,7 @@
           <w:sz w:val="22"/>
           <w:szCs w:val="22"/>
         </w:rPr>
-        <w:t xml:space="preserve">Holds the last seen sequenceNumber. Verifies each packet's checksum via ChecksumCalculator::compute(...) and compares its sequenceNumber against the expected value, detecting gaps and reordering. Returns a validation result: valid, corrupted, or a sequence gap detected.</w:t>
+        <w:t xml:space="preserve">Holds the last seen sequenceNumber. Verifies each packet's payload size, checksum via ChecksumCalculator::compute(...), and sequenceNumber continuity. Returns one of four results: Valid, PayloadSizeMismatch, ChecksumMismatch, or SequenceGap.</w:t>
       </w:r>
     </w:p>
     <w:p>
@@ -290,7 +290,7 @@
           <w:sz w:val="22"/>
           <w:szCs w:val="22"/>
         </w:rPr>
-        <w:t xml:space="preserve">Runs on its own thread (std::thread) with a period of reportIntervalSeconds, independent of the main packet-receiving loop. On each tick it checks SignalController::isPaused(); if Consumer is not paused, it takes a snapshot() from StatsCollector, computes the delta against the previous snapshot (packets/sec, bytes/sec), and prints a statistics line. It prints nothing while paused. Holds a reference to StatsCollector and SignalController without owning them.</w:t>
+        <w:t xml:space="preserve">Runs on its own thread (std::thread) with a period of interval_, independent of the main packet-receiving loop; the wait between ticks is polled in short chunks so stop() responds promptly instead of blocking for a full interval. On each tick it checks SignalController::isPaused(); if Consumer is not paused, it takes a snapshot() from StatsCollector, computes the delta against the previous snapshot (packets/sec, bytes/sec), and prints a statistics line. It prints nothing while paused. Holds a reference to StatsCollector and SignalController without owning them.</w:t>
       </w:r>
     </w:p>
     <w:p>
@@ -324,7 +324,41 @@
           <w:sz w:val="22"/>
           <w:szCs w:val="22"/>
         </w:rPr>
-        <w:t xml:space="preserve">Installs signal handlers (sigaction) for the custom signals SIGUSR1 (pause) and SIGUSR2 (resume). Holds an atomic paused flag. While paused, the ConsumerApplication main loop does not call SharedRingBufferReader::tryConsume() at all — packet reception stops entirely.</w:t>
+        <w:t xml:space="preserve">Installs signal handlers (sigaction) for SIGUSR1 (pause), SIGUSR2 (resume), and SIGINT/SIGTERM (graceful shutdown). Holds two atomic flags, paused and stopRequested, checked by the main loop; togglePause() lets KeypressListener flip the pause flag without a signal. While paused, the ConsumerApplication main loop does not call SharedRingBufferReader::tryConsume() at all — packet reception stops entirely.</w:t>
+      </w:r>
+    </w:p>
+    <w:p>
+      <w:pPr>
+        <w:spacing w:after="100"/>
+        <w:rPr>
+          <w:b/>
+          <w:sz w:val="28"/>
+          <w:szCs w:val="28"/>
+        </w:rPr>
+      </w:pPr>
+      <w:r>
+        <w:rPr>
+          <w:b/>
+          <w:sz w:val="28"/>
+          <w:szCs w:val="28"/>
+        </w:rPr>
+        <w:t xml:space="preserve">KeypressListener</w:t>
+      </w:r>
+    </w:p>
+    <w:p>
+      <w:pPr>
+        <w:spacing w:after="320"/>
+        <w:rPr>
+          <w:sz w:val="22"/>
+          <w:szCs w:val="22"/>
+        </w:rPr>
+      </w:pPr>
+      <w:r>
+        <w:rPr>
+          <w:sz w:val="22"/>
+          <w:szCs w:val="22"/>
+        </w:rPr>
+        <w:t xml:space="preserve">Alternative to SIGUSR1/SIGUSR2: puts the terminal into raw mode and reads stdin on a background thread, toggling SignalController's pause flag on any keypress. A no-op if stdin is not a terminal.</w:t>
       </w:r>
     </w:p>
     <w:p>
@@ -358,7 +392,7 @@
           <w:sz w:val="22"/>
           <w:szCs w:val="22"/>
         </w:rPr>
-        <w:t xml:space="preserve">Entry point and orchestrator of the application. Parses CliOptions, creates and owns instances of SharedRingBufferReader, PacketValidator, StatsCollector, StatsReporterThread, and SignalController. Starts StatsReporterThread::start() at startup and StatsReporterThread::stop() at shutdown. Runs the main loop: check the pause state, read a packet via SharedRingBufferReader::tryConsume(), validate it via PacketValidator, update the counters in StatsCollector — until the process receives a termination signal.</w:t>
+        <w:t xml:space="preserve">Entry point and orchestrator of the application. Parses CliOptions, creates and owns instances of SharedRingBufferReader, PacketValidator, StatsCollector, StatsReporterThread, SignalController, and KeypressListener. Starts StatsReporterThread::start() at startup and StatsReporterThread::stop() at shutdown. Runs the main loop: check the pause state, read a packet via SharedRingBufferReader::tryConsume(), validate it via PacketValidator, update the counters in StatsCollector — until SignalController reports a stop request.</w:t>
       </w:r>
     </w:p>
     <w:sectPr>

</xml_diff>